<commit_message>
docs: regenerate submission DOCX with updated authors + corrected conclusions
- manuscript.docx (2.18MB): updated CRC author list + corrected conclusions, figures embedded
- cover_letter.docx: updated author signatures
</commit_message>
<xml_diff>
--- a/05_Submission/cover_letter.docx
+++ b/05_Submission/cover_letter.docx
@@ -2,13 +2,23 @@
 <file path=word/document.xml><?xml version="1.0" encoding="utf-8"?>
 <w:document xmlns:w="http://schemas.openxmlformats.org/wordprocessingml/2006/main" xmlns:m="http://schemas.openxmlformats.org/officeDocument/2006/math" xmlns:r="http://schemas.openxmlformats.org/officeDocument/2006/relationships" xmlns:o="urn:schemas-microsoft-com:office:office" xmlns:v="urn:schemas-microsoft-com:vml" xmlns:w10="urn:schemas-microsoft-com:office:word" xmlns:a="http://schemas.openxmlformats.org/drawingml/2006/main" xmlns:pic="http://schemas.openxmlformats.org/drawingml/2006/picture" xmlns:wp="http://schemas.openxmlformats.org/drawingml/2006/wordprocessingDrawing">
   <w:body>
-    <w:bookmarkStart w:id="14" w:name="cover-letter"/>
+    <w:bookmarkStart w:id="9" w:name="Xe1e05fd82d0dd13f05dbab8de72d899e8172b64"/>
     <w:p>
       <w:pPr>
         <w:pStyle w:val="Heading1"/>
       </w:pPr>
       <w:r>
-        <w:t xml:space="preserve">Cover Letter</w:t>
+        <w:t xml:space="preserve">Cover Letter — Submission to</w:t>
+      </w:r>
+      <w:r>
+        <w:t xml:space="preserve"> </w:t>
+      </w:r>
+      <w:r>
+        <w:rPr>
+          <w:i/>
+          <w:iCs/>
+        </w:rPr>
+        <w:t xml:space="preserve">Briefings in Bioinformatics</w:t>
       </w:r>
     </w:p>
     <w:p>
@@ -23,7 +33,7 @@
         <w:t xml:space="preserve">Date</w:t>
       </w:r>
       <w:r>
-        <w:t xml:space="preserve">: June 19, 2026</w:t>
+        <w:t xml:space="preserve">: July 3, 2026</w:t>
       </w:r>
     </w:p>
     <w:p>
@@ -41,7 +51,7 @@
         <w:t xml:space="preserve">: The Editors</w:t>
       </w:r>
       <w:r>
-        <w:br/>
+        <w:t xml:space="preserve"> </w:t>
       </w:r>
       <w:r>
         <w:rPr>
@@ -51,7 +61,7 @@
         <w:t xml:space="preserve">Briefings in Bioinformatics</w:t>
       </w:r>
       <w:r>
-        <w:br/>
+        <w:t xml:space="preserve"> </w:t>
       </w:r>
       <w:r>
         <w:t xml:space="preserve">Oxford University Press</w:t>
@@ -69,7 +79,7 @@
         <w:t xml:space="preserve">Re</w:t>
       </w:r>
       <w:r>
-        <w:t xml:space="preserve">: Submission of manuscript —</w:t>
+        <w:t xml:space="preserve">: Submission of original research article –</w:t>
       </w:r>
       <w:r>
         <w:t xml:space="preserve"> </w:t>
@@ -98,19 +108,57 @@
         <w:pStyle w:val="BodyText"/>
       </w:pPr>
       <w:r>
-        <w:t xml:space="preserve">We are pleased to submit our manuscript entitled</w:t>
+        <w:rPr>
+          <w:b/>
+          <w:bCs/>
+        </w:rPr>
+        <w:t xml:space="preserve">Label quality, not architecture, defines the performance ceiling.</w:t>
       </w:r>
       <w:r>
         <w:t xml:space="preserve"> </w:t>
       </w:r>
       <w:r>
-        <w:t xml:space="preserve">“Systematic Benchmarking of Deep Learning Architectures for Peptide-MHC Binding Prediction Reveals Label Quality, Not Architecture, Defines Performance”</w:t>
-      </w:r>
-      <w:r>
-        <w:t xml:space="preserve"> </w:t>
-      </w:r>
-      <w:r>
-        <w:t xml:space="preserve">for consideration for publication in</w:t>
+        <w:t xml:space="preserve">We submit a manuscript that demonstrates, through systematic benchmarking, that the immunoinformatics field should invest in better training labels rather than more complex neural architectures. Across three labelling strategies, label source accounted for ~29 percentage points of accuracy variation, exceeding the maximum inter-architecture difference of ~11 percentage points. A simple position-specific scoring matrix (PSSM) baseline achieved 94.8% accuracy – outperforming all six deep learning architectures tested.</w:t>
+      </w:r>
+    </w:p>
+    <w:p>
+      <w:pPr>
+        <w:pStyle w:val="BodyText"/>
+      </w:pPr>
+      <w:r>
+        <w:t xml:space="preserve">We systematically compared six architectures under fully controlled conditions (identical training data, encoding, and evaluation protocols): a deep feed-forward network (FFN, 152K parameters) achieved 91.9% accuracy, outperforming CNN (1.05M), ResNet-style (325K), and LSTM (24K) architectures, confirming that architectural complexity beyond depth with batch normalisation provides diminishing returns for this well-characterised anchor-motif task. ESM-2 t6 per-position embeddings modestly improved accuracy to 93.3%, while mean-pooled embeddings collapsed to 65.9%, providing direct evidence that residue-position-specific features are essential for MHC-I binding.</w:t>
+      </w:r>
+    </w:p>
+    <w:p>
+      <w:pPr>
+        <w:pStyle w:val="BodyText"/>
+      </w:pPr>
+      <w:r>
+        <w:t xml:space="preserve">External validation against 49 experimentally verified IEDB epitopes yielded 93.9% sensitivity (ROC AUC 0.947). In a translational application, cancer hotspot mutation scanning across p53 and KRAS identified neoepitope candidates including p53 R248W and KRAS G12V. Molecular docking of the KRAS G12V neoepitope (YKLVVVGAV) predicts a K-E63 salt bridge with HLA-A*02:01 (estimated Coulombic stabilisation of approximately -30 kcal/mol vs. approximately -3 kcal/mol for canonical hydrophobic P2 burial), representing a testable structural hypothesis for a charged P2 anchor compensation mechanism.</w:t>
+      </w:r>
+    </w:p>
+    <w:p>
+      <w:pPr>
+        <w:pStyle w:val="BodyText"/>
+      </w:pPr>
+      <w:r>
+        <w:t xml:space="preserve">These findings connect directly to Preibisch et al. (2026), who report that over 55% of IEDB entries are computationally rather than experimentally labelled. Our results quantify the downstream consequences of this label provenance problem: models trained on derivative labels inherit the biases of their teachers, and the weak binder class is the primary locus of this variation (F1: 0.925 [PSSM] vs. 0.880 [MHCflurry]). We recommend that future benchmarking studies explicitly report label provenance and include biophysical baselines as comparators.</w:t>
+      </w:r>
+    </w:p>
+    <w:p>
+      <w:pPr>
+        <w:pStyle w:val="BodyText"/>
+      </w:pPr>
+      <w:r>
+        <w:t xml:space="preserve">All code, trained models, feature matrices, and prediction results are provided as a fully reproducible open-source pipeline (R and Python, with Jupyter notebooks documenting each analytical step), publicly available at https://github.com/woodhaha/peptide-epitope-prediction.</w:t>
+      </w:r>
+    </w:p>
+    <w:p>
+      <w:pPr>
+        <w:pStyle w:val="BodyText"/>
+      </w:pPr>
+      <w:r>
+        <w:t xml:space="preserve">We believe this work aligns well with</w:t>
       </w:r>
       <w:r>
         <w:t xml:space="preserve"> </w:t>
@@ -123,40 +171,7 @@
         <w:t xml:space="preserve">Briefings in Bioinformatics</w:t>
       </w:r>
       <w:r>
-        <w:t xml:space="preserve">.</w:t>
-      </w:r>
-    </w:p>
-    <w:bookmarkStart w:id="9" w:name="significance-and-fit"/>
-    <w:p>
-      <w:pPr>
-        <w:pStyle w:val="Heading3"/>
-      </w:pPr>
-      <w:r>
-        <w:t xml:space="preserve">Significance and Fit</w:t>
-      </w:r>
-    </w:p>
-    <w:p>
-      <w:pPr>
-        <w:pStyle w:val="FirstParagraph"/>
-      </w:pPr>
-      <w:r>
-        <w:t xml:space="preserve">Computational prediction of peptide-MHC binding is a foundational task in immunoinformatics with direct applications in cancer immunotherapy and neoantigen discovery. Our manuscript addresses three gaps we believe are of broad interest to the</w:t>
-      </w:r>
-      <w:r>
-        <w:t xml:space="preserve"> </w:t>
-      </w:r>
-      <w:r>
-        <w:rPr>
-          <w:i/>
-          <w:iCs/>
-        </w:rPr>
-        <w:t xml:space="preserve">Briefings in Bioinformatics</w:t>
-      </w:r>
-      <w:r>
-        <w:t xml:space="preserve"> </w:t>
-      </w:r>
-      <w:r>
-        <w:t xml:space="preserve">readership.</w:t>
+        <w:t xml:space="preserve">, which has a strong tradition of publishing methodological benchmark studies and reproducible computational pipelines of broad interest to the immunoinformatics and computational biology communities.</w:t>
       </w:r>
     </w:p>
     <w:p>
@@ -164,184 +179,26 @@
         <w:pStyle w:val="BodyText"/>
       </w:pPr>
       <w:r>
-        <w:t xml:space="preserve">First, and most importantly, we quantify the impact of training label quality on downstream model performance — a question that is widely acknowledged but rarely measured systematically. Across three labelling strategies (MHCflurry 2.2.0, a position-specific scoring matrix based on crystallographic anchor preferences, and random synthetic labels), label source accounted for ~29 percentage points of accuracy variation, exceeding the maximum inter-architecture difference of 10.8 percentage points. A simple PSSM baseline achieved 94.8% accuracy, outperforming all neural network architectures. These findings carry direct implications for how the field benchmarks and reports model performance, particularly given emerging evidence that over 55% of IEDB entries are computationally rather than experimentally labelled (Preibisch et al., 2026). We recommend that future benchmarking studies explicitly report label provenance.</w:t>
+        <w:t xml:space="preserve">This manuscript has not been published previously and is not under consideration elsewhere. All authors have approved the manuscript and agree with its submission. The authors declare no competing interests. No specific grant funding was received for this work.</w:t>
       </w:r>
     </w:p>
     <w:p>
       <w:pPr>
         <w:pStyle w:val="BodyText"/>
-      </w:pPr>
-      <w:r>
-        <w:t xml:space="preserve">Second, we systematically benchmark six deep learning architectures under fully controlled conditions (identical training data, encoding, and evaluation protocols) and evaluate ESM-2 protein language model embeddings against the standard BLOSUM62 encoding. ESM-2 t6 per-position embeddings achieved the highest neural network accuracy (93.3%), modestly exceeding BLOSUM62 (91.9%), while a mean-pooled ablation collapsed to 65.9%, confirming that positional information is essential for MHC-I binding prediction. The shallower t6 embeddings (8M parameters, 2,880 dimensions) outperformed the deeper t12 variant (35M parameters, 4,320 dimensions), revealing a data-to-dimensionality matching constraint with practical implications for groups working with modestly sized training sets.</w:t>
-      </w:r>
-    </w:p>
-    <w:p>
-      <w:pPr>
-        <w:pStyle w:val="BodyText"/>
-      </w:pPr>
-      <w:r>
-        <w:t xml:space="preserve">Third, we demonstrate a complete translational pipeline: protein epitope scanning (10 proteins, 3,536 peptides), cancer hotspot mutation analysis (16 mutations across p53 and KRAS), and external validation against 49 experimentally verified IEDB epitopes (93.9% sensitivity, 75.0% specificity, ROC AUC 0.947). Molecular docking generates the testable structural hypothesis that a K-E63 salt bridge may compensate for the non-canonical lysine at P2 of the KRAS G12V neoepitope (YKLVVVGAV). We present this as a docking-derived hypothesis requiring experimental validation by X-ray crystallography or cryo-EM.</w:t>
-      </w:r>
-    </w:p>
-    <w:bookmarkEnd w:id="9"/>
-    <w:bookmarkStart w:id="10" w:name="novel-contributions"/>
-    <w:p>
-      <w:pPr>
-        <w:pStyle w:val="Heading3"/>
-      </w:pPr>
-      <w:r>
-        <w:t xml:space="preserve">Novel Contributions</w:t>
-      </w:r>
-    </w:p>
-    <w:p>
-      <w:pPr>
-        <w:pStyle w:val="Compact"/>
-        <w:numPr>
-          <w:ilvl w:val="0"/>
-          <w:numId w:val="1001"/>
-        </w:numPr>
       </w:pPr>
       <w:r>
         <w:rPr>
           <w:b/>
           <w:bCs/>
         </w:rPr>
-        <w:t xml:space="preserve">Label quality, not architecture, defines the performance ceiling</w:t>
-      </w:r>
-      <w:r>
-        <w:t xml:space="preserve">: Systematic quantification across three labelling strategies, demonstrating that label provenance accounts for more performance variation (~29 pp) than architecture choice (~11 pp). A simple PSSM baseline (94.8%) outperforms all neural networks, underscoring that biophysical knowledge should be included as a comparator in computational benchmarking.</w:t>
-      </w:r>
-    </w:p>
-    <w:p>
-      <w:pPr>
-        <w:pStyle w:val="Compact"/>
+        <w:t xml:space="preserve">Suggested Reviewers</w:t>
+      </w:r>
+    </w:p>
+    <w:p>
+      <w:pPr>
         <w:numPr>
           <w:ilvl w:val="0"/>
           <w:numId w:val="1001"/>
-        </w:numPr>
-      </w:pPr>
-      <w:r>
-        <w:rPr>
-          <w:b/>
-          <w:bCs/>
-        </w:rPr>
-        <w:t xml:space="preserve">ESM-2 embeddings offer modest gains over BLOSUM62</w:t>
-      </w:r>
-      <w:r>
-        <w:t xml:space="preserve">: ESM-2 t6 per-position embeddings (93.3%) modestly exceed BLOSUM62 (91.9%), while mean-pooled embeddings collapse to 65.9%, confirming positional information is essential. The shallower t6 variant outperforms the deeper t12 variant due to data-to-dimensionality matching — a practical finding for groups applying protein language models to peptide-MHC tasks.</w:t>
-      </w:r>
-    </w:p>
-    <w:p>
-      <w:pPr>
-        <w:pStyle w:val="Compact"/>
-        <w:numPr>
-          <w:ilvl w:val="0"/>
-          <w:numId w:val="1001"/>
-        </w:numPr>
-      </w:pPr>
-      <w:r>
-        <w:rPr>
-          <w:b/>
-          <w:bCs/>
-        </w:rPr>
-        <w:t xml:space="preserve">Systematic six-architecture comparison under controlled conditions</w:t>
-      </w:r>
-      <w:r>
-        <w:t xml:space="preserve">: Confirms that architectural complexity beyond additional depth with batch normalisation provides diminishing returns for positional binding tasks; the Deep FFN (152,823 parameters) outperforms CNN (1,053,863), LSTM (23,939), and ResNet-style (324,931) architectures.</w:t>
-      </w:r>
-    </w:p>
-    <w:p>
-      <w:pPr>
-        <w:pStyle w:val="Compact"/>
-        <w:numPr>
-          <w:ilvl w:val="0"/>
-          <w:numId w:val="1001"/>
-        </w:numPr>
-      </w:pPr>
-      <w:r>
-        <w:rPr>
-          <w:b/>
-          <w:bCs/>
-        </w:rPr>
-        <w:t xml:space="preserve">K-E63 salt bridge as a testable structural hypothesis</w:t>
-      </w:r>
-      <w:r>
-        <w:t xml:space="preserve">: Molecular docking predicts electrostatic compensation between a charged P2 lysine and the conserved Glu63 in the HLA-A*02:01 B-pocket as a potential non-canonical anchor compensation mechanism. This is presented as a docking-derived hypothesis requiring experimental validation.</w:t>
-      </w:r>
-    </w:p>
-    <w:p>
-      <w:pPr>
-        <w:pStyle w:val="Compact"/>
-        <w:numPr>
-          <w:ilvl w:val="0"/>
-          <w:numId w:val="1001"/>
-        </w:numPr>
-      </w:pPr>
-      <w:r>
-        <w:rPr>
-          <w:b/>
-          <w:bCs/>
-        </w:rPr>
-        <w:t xml:space="preserve">Fully reproducible open-source pipeline</w:t>
-      </w:r>
-      <w:r>
-        <w:t xml:space="preserve">: All code (1,700+ lines, R/Python), trained models, feature matrices, and all prediction results are provided in a single data package with a documented decision log.</w:t>
-      </w:r>
-    </w:p>
-    <w:bookmarkEnd w:id="10"/>
-    <w:bookmarkStart w:id="11" w:name="editorial-considerations"/>
-    <w:p>
-      <w:pPr>
-        <w:pStyle w:val="Heading3"/>
-      </w:pPr>
-      <w:r>
-        <w:t xml:space="preserve">Editorial Considerations</w:t>
-      </w:r>
-    </w:p>
-    <w:p>
-      <w:pPr>
-        <w:pStyle w:val="FirstParagraph"/>
-      </w:pPr>
-      <w:r>
-        <w:t xml:space="preserve">This manuscript has not been published previously and is not under consideration elsewhere. All authors have approved the manuscript and agree with its submission to</w:t>
-      </w:r>
-      <w:r>
-        <w:t xml:space="preserve"> </w:t>
-      </w:r>
-      <w:r>
-        <w:rPr>
-          <w:i/>
-          <w:iCs/>
-        </w:rPr>
-        <w:t xml:space="preserve">Briefings in Bioinformatics</w:t>
-      </w:r>
-      <w:r>
-        <w:t xml:space="preserve">.</w:t>
-      </w:r>
-    </w:p>
-    <w:p>
-      <w:pPr>
-        <w:pStyle w:val="BodyText"/>
-      </w:pPr>
-      <w:r>
-        <w:t xml:space="preserve">We have no conflicts of interest to declare. This work did not receive specific grant funding.</w:t>
-      </w:r>
-    </w:p>
-    <w:bookmarkEnd w:id="11"/>
-    <w:bookmarkStart w:id="12" w:name="suggested-reviewers"/>
-    <w:p>
-      <w:pPr>
-        <w:pStyle w:val="Heading3"/>
-      </w:pPr>
-      <w:r>
-        <w:t xml:space="preserve">Suggested Reviewers</w:t>
-      </w:r>
-    </w:p>
-    <w:p>
-      <w:pPr>
-        <w:numPr>
-          <w:ilvl w:val="0"/>
-          <w:numId w:val="1002"/>
         </w:numPr>
       </w:pPr>
       <w:r>
@@ -355,61 +212,14 @@
         <w:t xml:space="preserve"> </w:t>
       </w:r>
       <w:r>
-        <w:t xml:space="preserve">— Department of Health Technology, Technical University of Denmark (DTU), Kongens Lyngby, Denmark</w:t>
-      </w:r>
-      <w:r>
-        <w:br/>
-      </w:r>
-      <w:r>
-        <w:rPr>
-          <w:i/>
-          <w:iCs/>
-        </w:rPr>
-        <w:t xml:space="preserve">Expertise</w:t>
-      </w:r>
-      <w:r>
-        <w:t xml:space="preserve">: Immunoinformatics, peptide-MHC binding prediction, NetMHCpan development</w:t>
+        <w:t xml:space="preserve">– Department of Health Technology, Technical University of Denmark (DTU), Kongens Lyngby, Denmark. Developer of NetMHCpan; leading expertise in peptide-MHC binding prediction and immunoinformatics benchmarking.</w:t>
       </w:r>
     </w:p>
     <w:p>
       <w:pPr>
         <w:numPr>
           <w:ilvl w:val="0"/>
-          <w:numId w:val="1002"/>
-        </w:numPr>
-      </w:pPr>
-      <w:r>
-        <w:rPr>
-          <w:b/>
-          <w:bCs/>
-        </w:rPr>
-        <w:t xml:space="preserve">Associate Professor Jiangning Song</w:t>
-      </w:r>
-      <w:r>
-        <w:t xml:space="preserve"> </w:t>
-      </w:r>
-      <w:r>
-        <w:t xml:space="preserve">— Biomedicine Discovery Institute, Monash University, Melbourne, Australia</w:t>
-      </w:r>
-      <w:r>
-        <w:br/>
-      </w:r>
-      <w:r>
-        <w:rPr>
-          <w:i/>
-          <w:iCs/>
-        </w:rPr>
-        <w:t xml:space="preserve">Expertise</w:t>
-      </w:r>
-      <w:r>
-        <w:t xml:space="preserve">: Systematic benchmarking of bioinformatics methods, HLA-I peptide binding prediction tools</w:t>
-      </w:r>
-    </w:p>
-    <w:p>
-      <w:pPr>
-        <w:numPr>
-          <w:ilvl w:val="0"/>
-          <w:numId w:val="1002"/>
+          <w:numId w:val="1001"/>
         </w:numPr>
       </w:pPr>
       <w:r>
@@ -423,30 +233,28 @@
         <w:t xml:space="preserve"> </w:t>
       </w:r>
       <w:r>
-        <w:t xml:space="preserve">— La Jolla Institute for Immunology (LJI), La Jolla, California, USA</w:t>
-      </w:r>
-      <w:r>
-        <w:br/>
-      </w:r>
+        <w:t xml:space="preserve">– La Jolla Institute for Immunology (LJI), La Jolla, California, USA. Director of the Immune Epitope Database (IEDB); expertise in computational immunology and epitope prediction benchmarking standards.</w:t>
+      </w:r>
+    </w:p>
+    <w:p>
+      <w:pPr>
+        <w:numPr>
+          <w:ilvl w:val="0"/>
+          <w:numId w:val="1001"/>
+        </w:numPr>
+      </w:pPr>
       <w:r>
         <w:rPr>
-          <w:i/>
-          <w:iCs/>
+          <w:b/>
+          <w:bCs/>
         </w:rPr>
-        <w:t xml:space="preserve">Expertise</w:t>
-      </w:r>
-      <w:r>
-        <w:t xml:space="preserve">: Immune Epitope Database (IEDB), computational immunology, epitope prediction benchmarking</w:t>
-      </w:r>
-    </w:p>
-    <w:bookmarkEnd w:id="12"/>
-    <w:bookmarkStart w:id="13" w:name="ai-tool-disclosure"/>
-    <w:p>
-      <w:pPr>
-        <w:pStyle w:val="Heading3"/>
-      </w:pPr>
-      <w:r>
-        <w:t xml:space="preserve">AI Tool Disclosure</w:t>
+        <w:t xml:space="preserve">Dr. Timothy O’Donnell</w:t>
+      </w:r>
+      <w:r>
+        <w:t xml:space="preserve"> </w:t>
+      </w:r>
+      <w:r>
+        <w:t xml:space="preserve">– Memorial Sloan Kettering Cancer Center, New York, USA (formerly OpenVax). Developer of MHCflurry; deep expertise in deep learning architectures for peptide-MHC binding prediction.</w:t>
       </w:r>
     </w:p>
     <w:p>
@@ -454,38 +262,7 @@
         <w:pStyle w:val="FirstParagraph"/>
       </w:pPr>
       <w:r>
-        <w:t xml:space="preserve">In accordance with</w:t>
-      </w:r>
-      <w:r>
-        <w:t xml:space="preserve"> </w:t>
-      </w:r>
-      <w:r>
-        <w:rPr>
-          <w:i/>
-          <w:iCs/>
-        </w:rPr>
-        <w:t xml:space="preserve">Briefings in Bioinformatics</w:t>
-      </w:r>
-      <w:r>
-        <w:t xml:space="preserve"> </w:t>
-      </w:r>
-      <w:r>
-        <w:t xml:space="preserve">author guidelines, we disclose the use of AI-assisted tools (Claude Code, Anthropic, June 2026) for code development, literature search, and manuscript editing. All scientific content, interpretations, and conclusions were authored and approved by the human authors, who take full responsibility for the manuscript’s content. No AI tools were listed as authors.</w:t>
-      </w:r>
-    </w:p>
-    <w:p>
-      <w:r>
-        <w:pict>
-          <v:rect style="width:0;height:1.5pt" o:hralign="center" o:hrstd="t" o:hr="t"/>
-        </w:pict>
-      </w:r>
-    </w:p>
-    <w:p>
-      <w:pPr>
-        <w:pStyle w:val="FirstParagraph"/>
-      </w:pPr>
-      <w:r>
-        <w:t xml:space="preserve">We appreciate your consideration of our manuscript and look forward to your response.</w:t>
+        <w:t xml:space="preserve">We appreciate your consideration and look forward to your response.</w:t>
       </w:r>
     </w:p>
     <w:p>
@@ -493,7 +270,7 @@
         <w:pStyle w:val="BodyText"/>
       </w:pPr>
       <w:r>
-        <w:t xml:space="preserve">Sincerely,</w:t>
+        <w:t xml:space="preserve">Respectfully,</w:t>
       </w:r>
     </w:p>
     <w:p>
@@ -508,34 +285,34 @@
         <w:t xml:space="preserve">Zhuha Zhou, MD</w:t>
       </w:r>
       <w:r>
-        <w:t xml:space="preserve">†,*</w:t>
-      </w:r>
-      <w:r>
-        <w:br/>
+        <w:t xml:space="preserve">dagger,*</w:t>
+      </w:r>
+      <w:r>
+        <w:t xml:space="preserve"> </w:t>
       </w:r>
       <w:r>
         <w:t xml:space="preserve">Department of Gastroenterology Surgery</w:t>
       </w:r>
       <w:r>
-        <w:br/>
+        <w:t xml:space="preserve"> </w:t>
       </w:r>
       <w:r>
         <w:t xml:space="preserve">The First Affiliated Hospital of Wenzhou Medical University</w:t>
       </w:r>
       <w:r>
-        <w:br/>
+        <w:t xml:space="preserve"> </w:t>
       </w:r>
       <w:r>
         <w:t xml:space="preserve">Nanbaixiang Street, Ouhai District, 325000 Wenzhou, Zhejiang, China</w:t>
       </w:r>
       <w:r>
-        <w:br/>
+        <w:t xml:space="preserve"> </w:t>
       </w:r>
       <w:r>
         <w:t xml:space="preserve">E-mail: zhouzhuha@wmu.edu.cn</w:t>
       </w:r>
       <w:r>
-        <w:br/>
+        <w:t xml:space="preserve"> </w:t>
       </w:r>
       <w:r>
         <w:t xml:space="preserve">ORCID: 0009-0005-1818-4789</w:t>
@@ -546,128 +323,73 @@
         <w:pStyle w:val="BodyText"/>
       </w:pPr>
       <w:r>
+        <w:t xml:space="preserve">On behalf of all authors:</w:t>
+      </w:r>
+      <w:r>
+        <w:t xml:space="preserve"> </w:t>
+      </w:r>
+      <w:r>
+        <w:t xml:space="preserve">Chen Weisheng</w:t>
+      </w:r>
+      <w:r>
+        <w:t xml:space="preserve">dagger</w:t>
+      </w:r>
+      <w:r>
+        <w:t xml:space="preserve">, Yiqi Cai, Yongyu Bai</w:t>
+      </w:r>
+      <w:r>
+        <w:t xml:space="preserve">dagger</w:t>
+      </w:r>
+      <w:r>
+        <w:t xml:space="preserve">, Qigang Xu, Zhuxian Zhou</w:t>
+      </w:r>
+    </w:p>
+    <w:p>
+      <w:pPr>
+        <w:pStyle w:val="BodyText"/>
+      </w:pPr>
+      <w:r>
+        <w:t xml:space="preserve">dagger</w:t>
+      </w:r>
+      <w:r>
+        <w:t xml:space="preserve"> </w:t>
+      </w:r>
+      <w:r>
+        <w:t xml:space="preserve">These authors contributed equally to this work.</w:t>
+      </w:r>
+      <w:r>
+        <w:t xml:space="preserve"> </w:t>
+      </w:r>
+      <w:r>
+        <w:t xml:space="preserve">*</w:t>
+      </w:r>
+      <w:r>
+        <w:t xml:space="preserve"> </w:t>
+      </w:r>
+      <w:r>
+        <w:t xml:space="preserve">Corresponding Author</w:t>
+      </w:r>
+    </w:p>
+    <w:p>
+      <w:r>
+        <w:pict>
+          <v:rect style="width:0;height:1.5pt" o:hralign="center" o:hrstd="t" o:hr="t"/>
+        </w:pict>
+      </w:r>
+    </w:p>
+    <w:p>
+      <w:pPr>
+        <w:pStyle w:val="FirstParagraph"/>
+      </w:pPr>
+      <w:r>
         <w:rPr>
-          <w:b/>
-          <w:bCs/>
+          <w:i/>
+          <w:iCs/>
         </w:rPr>
-        <w:t xml:space="preserve">Yongyu Bai, MD</w:t>
-      </w:r>
-      <w:r>
-        <w:t xml:space="preserve">†</w:t>
-      </w:r>
-      <w:r>
-        <w:br/>
-      </w:r>
-      <w:r>
-        <w:t xml:space="preserve">Department of Gastroenterology Surgery</w:t>
-      </w:r>
-      <w:r>
-        <w:br/>
-      </w:r>
-      <w:r>
-        <w:t xml:space="preserve">The First Affiliated Hospital of Wenzhou Medical University</w:t>
-      </w:r>
-    </w:p>
-    <w:p>
-      <w:pPr>
-        <w:pStyle w:val="BodyText"/>
-      </w:pPr>
-      <w:r>
-        <w:rPr>
-          <w:b/>
-          <w:bCs/>
-        </w:rPr>
-        <w:t xml:space="preserve">Qigang Xu, MD</w:t>
-      </w:r>
-      <w:r>
-        <w:br/>
-      </w:r>
-      <w:r>
-        <w:t xml:space="preserve">Department of Hepatobiliary and Pancreatic Surgery</w:t>
-      </w:r>
-      <w:r>
-        <w:br/>
-      </w:r>
-      <w:r>
-        <w:t xml:space="preserve">The First Affiliated Hospital of Wenzhou Medical University</w:t>
-      </w:r>
-    </w:p>
-    <w:p>
-      <w:pPr>
-        <w:pStyle w:val="BodyText"/>
-      </w:pPr>
-      <w:r>
-        <w:rPr>
-          <w:b/>
-          <w:bCs/>
-        </w:rPr>
-        <w:t xml:space="preserve">Zhuxian Zhou, PhD</w:t>
-      </w:r>
-      <w:r>
-        <w:br/>
-      </w:r>
-      <w:r>
-        <w:t xml:space="preserve">Center for Bionanoengineering, College of Chemical and Biological Engineering</w:t>
-      </w:r>
-      <w:r>
-        <w:br/>
-      </w:r>
-      <w:r>
-        <w:t xml:space="preserve">Zhejiang University, Hangzhou 310027, China</w:t>
-      </w:r>
-    </w:p>
-    <w:p>
-      <w:pPr>
-        <w:pStyle w:val="BodyText"/>
-      </w:pPr>
-      <w:r>
-        <w:rPr>
-          <w:b/>
-          <w:bCs/>
-        </w:rPr>
-        <w:t xml:space="preserve">Shaoliang Han, MD</w:t>
-      </w:r>
-      <w:r>
-        <w:br/>
-      </w:r>
-      <w:r>
-        <w:t xml:space="preserve">Department of Gastroenterology Surgery</w:t>
-      </w:r>
-      <w:r>
-        <w:br/>
-      </w:r>
-      <w:r>
-        <w:t xml:space="preserve">The First Affiliated Hospital of Wenzhou Medical University</w:t>
-      </w:r>
-    </w:p>
-    <w:p>
-      <w:pPr>
-        <w:pStyle w:val="BodyText"/>
-      </w:pPr>
-      <w:r>
-        <w:t xml:space="preserve">†</w:t>
-      </w:r>
-      <w:r>
-        <w:t xml:space="preserve"> </w:t>
-      </w:r>
-      <w:r>
-        <w:t xml:space="preserve">These authors contributed equally to this work.</w:t>
-      </w:r>
-      <w:r>
-        <w:br/>
-      </w:r>
-      <w:r>
-        <w:t xml:space="preserve">*</w:t>
-      </w:r>
-      <w:r>
-        <w:t xml:space="preserve"> </w:t>
-      </w:r>
-      <w:r>
-        <w:t xml:space="preserve">Corresponding Author</w:t>
-      </w:r>
-    </w:p>
-    <w:bookmarkEnd w:id="13"/>
-    <w:bookmarkEnd w:id="14"/>
+        <w:t xml:space="preserve">Cover letter prepared for submission to Briefings in Bioinformatics. July 2026.</w:t>
+      </w:r>
+    </w:p>
+    <w:bookmarkEnd w:id="9"/>
     <w:sectPr>
       <w:footnotePr>
         <w:numRestart w:val="eachSect"/>
@@ -778,109 +500,6 @@
       </w:pPr>
     </w:lvl>
   </w:abstractNum>
-  <w:abstractNum w:abstractNumId="991">
-    <w:nsid w:val="0000A991"/>
-    <w:multiLevelType w:val="multilevel"/>
-    <w:lvl w:ilvl="0">
-      <w:numFmt w:val="bullet"/>
-      <w:lvlText w:val=""/>
-      <w:lvlJc w:val="left"/>
-      <w:pPr>
-        <w:ind w:left="720" w:hanging="360"/>
-      </w:pPr>
-      <w:rPr>
-        <w:rFonts w:ascii="Symbol" w:hAnsi="Symbol" w:cs="Symbol" w:hint="default"/>
-      </w:rPr>
-    </w:lvl>
-    <w:lvl w:ilvl="1">
-      <w:numFmt w:val="bullet"/>
-      <w:lvlText w:val="o"/>
-      <w:lvlJc w:val="left"/>
-      <w:pPr>
-        <w:ind w:left="1440" w:hanging="360"/>
-      </w:pPr>
-      <w:rPr>
-        <w:rFonts w:ascii="Courier New" w:hAnsi="Courier New" w:cs="Courier New" w:hint="default"/>
-      </w:rPr>
-    </w:lvl>
-    <w:lvl w:ilvl="2">
-      <w:numFmt w:val="bullet"/>
-      <w:lvlText w:val=""/>
-      <w:lvlJc w:val="left"/>
-      <w:pPr>
-        <w:ind w:left="2160" w:hanging="360"/>
-      </w:pPr>
-      <w:rPr>
-        <w:rFonts w:ascii="Wingdings" w:hAnsi="Wingdings" w:cs="Wingdings" w:hint="default"/>
-      </w:rPr>
-    </w:lvl>
-    <w:lvl w:ilvl="3">
-      <w:numFmt w:val="bullet"/>
-      <w:lvlText w:val=""/>
-      <w:lvlJc w:val="left"/>
-      <w:pPr>
-        <w:ind w:left="2880" w:hanging="360"/>
-      </w:pPr>
-      <w:rPr>
-        <w:rFonts w:ascii="Symbol" w:hAnsi="Symbol" w:cs="Symbol" w:hint="default"/>
-      </w:rPr>
-    </w:lvl>
-    <w:lvl w:ilvl="4">
-      <w:numFmt w:val="bullet"/>
-      <w:lvlText w:val="o"/>
-      <w:lvlJc w:val="left"/>
-      <w:pPr>
-        <w:ind w:left="3600" w:hanging="360"/>
-      </w:pPr>
-      <w:rPr>
-        <w:rFonts w:ascii="Courier New" w:hAnsi="Courier New" w:cs="Courier New" w:hint="default"/>
-      </w:rPr>
-    </w:lvl>
-    <w:lvl w:ilvl="5">
-      <w:numFmt w:val="bullet"/>
-      <w:lvlText w:val=""/>
-      <w:lvlJc w:val="left"/>
-      <w:pPr>
-        <w:ind w:left="4320" w:hanging="360"/>
-      </w:pPr>
-      <w:rPr>
-        <w:rFonts w:ascii="Wingdings" w:hAnsi="Wingdings" w:cs="Wingdings" w:hint="default"/>
-      </w:rPr>
-    </w:lvl>
-    <w:lvl w:ilvl="6">
-      <w:numFmt w:val="bullet"/>
-      <w:lvlText w:val=""/>
-      <w:lvlJc w:val="left"/>
-      <w:pPr>
-        <w:ind w:left="5040" w:hanging="360"/>
-      </w:pPr>
-      <w:rPr>
-        <w:rFonts w:ascii="Symbol" w:hAnsi="Symbol" w:cs="Symbol" w:hint="default"/>
-      </w:rPr>
-    </w:lvl>
-    <w:lvl w:ilvl="7">
-      <w:numFmt w:val="bullet"/>
-      <w:lvlText w:val="o"/>
-      <w:lvlJc w:val="left"/>
-      <w:pPr>
-        <w:ind w:left="5760" w:hanging="360"/>
-      </w:pPr>
-      <w:rPr>
-        <w:rFonts w:ascii="Courier New" w:hAnsi="Courier New" w:cs="Courier New" w:hint="default"/>
-      </w:rPr>
-    </w:lvl>
-    <w:lvl w:ilvl="8">
-      <w:numFmt w:val="bullet"/>
-      <w:lvlText w:val=""/>
-      <w:lvlJc w:val="left"/>
-      <w:pPr>
-        <w:ind w:left="6480" w:hanging="360"/>
-      </w:pPr>
-      <w:rPr>
-        <w:rFonts w:ascii="Wingdings" w:hAnsi="Wingdings" w:cs="Wingdings" w:hint="default"/>
-      </w:rPr>
-    </w:lvl>
-  </w:abstractNum>
   <w:abstractNum w:abstractNumId="99411">
     <w:nsid w:val="00A99411"/>
     <w:multiLevelType w:val="multilevel"/>
@@ -970,9 +589,6 @@
     <w:abstractNumId w:val="990"/>
   </w:num>
   <w:num w:numId="1001">
-    <w:abstractNumId w:val="991"/>
-  </w:num>
-  <w:num w:numId="1002">
     <w:abstractNumId w:val="99411"/>
     <w:lvlOverride w:ilvl="0">
       <w:startOverride w:val="1"/>

</xml_diff>